<commit_message>
Fix submission package terminology and tables
</commit_message>
<xml_diff>
--- a/evaluation/publication_results/manuscript_package_20260719/tirs_final_submission_package_20260720/submission_upload_files_20260720/03_Supplementary_Information_20260720.docx
+++ b/evaluation/publication_results/manuscript_package_20260719/tirs_final_submission_package_20260720/submission_upload_files_20260720/03_Supplementary_Information_20260720.docx
@@ -1354,7 +1354,7 @@
           <w:color w:val="000000"/>
           <w:sz w:val="24"/>
         </w:rPr>
-        <w:t>The final answer prompt required a direct answer, article-level citation, and refusal when the retrieved context did not contain the requested fact. The refusal rule was tightened after the first external stress test because the system sometimes answered current operational questions from related but insufficient regulatory text.</w:t>
+        <w:t>The final answer prompt required a direct answer, article-level citation, and refusal when the retrieved context did not contain the requested fact. The refusal rule was tightened after the first AI-authored prospective stress test because the system sometimes answered current operational questions from related but insufficient regulatory text.</w:t>
       </w:r>
     </w:p>
     <w:p>
@@ -1611,7 +1611,7 @@
           <w:color w:val="000000"/>
           <w:sz w:val="24"/>
         </w:rPr>
-        <w:t>The evidence-artifact folder contains per-question CSV outputs for the held-out internal benchmark, English completeness repair, Portuguese residual-quality repair, first external stress test, refusal-development run, and refusal-focused external test. These files include question identifiers, language, category, expected source or article fields when present, generated answers, retrieved evidence fields, and scoring fields.</w:t>
+        <w:t>The evidence-artifact folder contains per-question CSV outputs for the held-out internal benchmark, English completeness repair, Portuguese residual-quality repair, first AI-authored prospective stress test, refusal-development run, and refusal-focused external test. These files include question identifiers, language, category, expected source or article fields when present, generated answers, retrieved evidence fields, and scoring fields.</w:t>
       </w:r>
     </w:p>
     <w:p>
@@ -1677,7 +1677,7 @@
           <w:color w:val="000000"/>
           <w:sz w:val="24"/>
         </w:rPr>
-        <w:t>The development-results story table and TIRS decision-rationale file document the repair sequence: initial application/dependency diagnosis, corpus cleaning, article-aware indexing, hybrid retrieval, reranking, English retrieval anchors, answer-completeness repair, Portuguese residual-quality review, external stress testing, refusal calibration, and final pipeline freeze.</w:t>
+        <w:t>The development-results story table and TIRS decision-rationale file document the repair sequence: initial application/dependency diagnosis, corpus cleaning, article-aware indexing, hybrid retrieval, reranking, English retrieval anchors, answer-completeness repair, Portuguese residual-quality review, AI-authored prospective stress testing, refusal calibration, and final pipeline freeze.</w:t>
       </w:r>
     </w:p>
     <w:p>
@@ -1692,7 +1692,7 @@
           <w:color w:val="000000"/>
           <w:sz w:val="24"/>
         </w:rPr>
-        <w:t>Internal post-repair scores should not be interpreted as independent proof of generalization. They show that the repaired system passed its curated benchmark. The first external stress test changed the interpretation by showing that refusal calibration was the main remaining weakness. The second refusal-focused external test evaluated that repair using a separate external question set.</w:t>
+        <w:t>Internal post-repair scores should not be interpreted as independent proof of generalization. They show that the repaired system passed its curated benchmark. The first AI-authored prospective stress test changed the interpretation by showing that refusal calibration was the main remaining weakness. The second refusal-focused external test evaluated that repair using a separate AI-authored prospective question set.</w:t>
       </w:r>
     </w:p>
     <w:p>

</xml_diff>

<commit_message>
Add per-question supplementary audit data
</commit_message>
<xml_diff>
--- a/evaluation/publication_results/manuscript_package_20260719/tirs_final_submission_package_20260720/submission_upload_files_20260720/03_Supplementary_Information_20260720.docx
+++ b/evaluation/publication_results/manuscript_package_20260719/tirs_final_submission_package_20260720/submission_upload_files_20260720/03_Supplementary_Information_20260720.docx
@@ -46,6 +46,16 @@
           <w:sz w:val="24"/>
         </w:rPr>
         <w:t>Prepared: 2026-07-20</w:t>
+      </w:r>
+    </w:p>
+    <w:p>
+      <w:r>
+        <w:rPr>
+          <w:rFonts w:ascii="Times New Roman" w:hAnsi="Times New Roman" w:eastAsia="Times New Roman"/>
+          <w:color w:val="000000"/>
+          <w:sz w:val="24"/>
+        </w:rPr>
+        <w:t>Supplementary Data S1 provides a consolidated per-question audit table for the reported evaluation rows. It contains 404 evaluated rows across six stages: 150 internal held-out rows, 75 English completeness-repair rows, 75 Portuguese residual-quality rows, 50 AI-authored prospective stress-test rows, 24 refusal-calibration development rows, and 30 refusal-focused AI-authored test rows. The table includes the question, generated answer, expected answer fields when available, retrieval and citation outputs, deterministic metrics, AI-judge scores, detected error flags, and the fix or action linked to each row. The 404 evaluated rows should not be described as a 500-question evaluation. The authored question files contain 304 rows because some development and test stages evaluate overlapping question types rather than one single independent question bank.</w:t>
       </w:r>
     </w:p>
     <w:p>
@@ -1739,7 +1749,7 @@
     <w:p>
       <w:r>
         <w:rPr>
-          <w:rFonts w:ascii="Times New Roman" w:hAnsi="Times New Roman"/>
+          <w:rFonts w:ascii="Times New Roman" w:hAnsi="Times New Roman" w:eastAsia="Times New Roman"/>
           <w:color w:val="000000"/>
           <w:sz w:val="24"/>
         </w:rPr>
@@ -1752,7 +1762,7 @@
       </w:pPr>
       <w:r>
         <w:rPr>
-          <w:rFonts w:ascii="Times New Roman" w:hAnsi="Times New Roman"/>
+          <w:rFonts w:ascii="Times New Roman" w:hAnsi="Times New Roman" w:eastAsia="Times New Roman"/>
           <w:color w:val="000000"/>
           <w:sz w:val="24"/>
         </w:rPr>
@@ -1762,7 +1772,7 @@
     <w:p>
       <w:r>
         <w:rPr>
-          <w:rFonts w:ascii="Times New Roman" w:hAnsi="Times New Roman"/>
+          <w:rFonts w:ascii="Times New Roman" w:hAnsi="Times New Roman" w:eastAsia="Times New Roman"/>
           <w:color w:val="000000"/>
           <w:sz w:val="24"/>
         </w:rPr>
@@ -1772,7 +1782,7 @@
     <w:p>
       <w:r>
         <w:rPr>
-          <w:rFonts w:ascii="Times New Roman" w:hAnsi="Times New Roman"/>
+          <w:rFonts w:ascii="Times New Roman" w:hAnsi="Times New Roman" w:eastAsia="Times New Roman"/>
           <w:color w:val="000000"/>
           <w:sz w:val="24"/>
         </w:rPr>
@@ -1785,7 +1795,7 @@
       </w:pPr>
       <w:r>
         <w:rPr>
-          <w:rFonts w:ascii="Times New Roman" w:hAnsi="Times New Roman"/>
+          <w:rFonts w:ascii="Times New Roman" w:hAnsi="Times New Roman" w:eastAsia="Times New Roman"/>
           <w:color w:val="000000"/>
           <w:sz w:val="24"/>
         </w:rPr>
@@ -1795,7 +1805,7 @@
     <w:p>
       <w:r>
         <w:rPr>
-          <w:rFonts w:ascii="Times New Roman" w:hAnsi="Times New Roman"/>
+          <w:rFonts w:ascii="Times New Roman" w:hAnsi="Times New Roman" w:eastAsia="Times New Roman"/>
           <w:color w:val="000000"/>
           <w:sz w:val="24"/>
         </w:rPr>

</xml_diff>

<commit_message>
Add AI judge supplementary dossier
</commit_message>
<xml_diff>
--- a/evaluation/publication_results/manuscript_package_20260719/tirs_final_submission_package_20260720/submission_upload_files_20260720/03_Supplementary_Information_20260720.docx
+++ b/evaluation/publication_results/manuscript_package_20260719/tirs_final_submission_package_20260720/submission_upload_files_20260720/03_Supplementary_Information_20260720.docx
@@ -46,16 +46,6 @@
           <w:sz w:val="24"/>
         </w:rPr>
         <w:t>Prepared: 2026-07-20</w:t>
-      </w:r>
-    </w:p>
-    <w:p>
-      <w:r>
-        <w:rPr>
-          <w:rFonts w:ascii="Times New Roman" w:hAnsi="Times New Roman" w:eastAsia="Times New Roman"/>
-          <w:color w:val="000000"/>
-          <w:sz w:val="24"/>
-        </w:rPr>
-        <w:t>Supplementary Data S1 provides a consolidated per-question audit table for the reported evaluation rows. It contains 404 evaluated rows across six stages: 150 internal held-out rows, 75 English completeness-repair rows, 75 Portuguese residual-quality rows, 50 AI-authored prospective stress-test rows, 24 refusal-calibration development rows, and 30 refusal-focused AI-authored test rows. The table includes the question, generated answer, expected answer fields when available, retrieval and citation outputs, deterministic metrics, AI-judge scores, detected error flags, and the fix or action linked to each row. The 404 evaluated rows should not be described as a 500-question evaluation. The authored question files contain 304 rows because some development and test stages evaluate overlapping question types rather than one single independent question bank.</w:t>
       </w:r>
     </w:p>
     <w:p>
@@ -1594,6 +1584,11 @@
       </w:r>
     </w:p>
     <w:p>
+      <w:r>
+        <w:t>Supplementary Data S2 reports the automated AI-judge layer as a separate audit file. It identifies which questions were judged, the four scoring criteria, model settings, the exact prompt template, row-level scores and rationales, stage-level metrics, and the conclusions and recommendations drawn from each stage. It also documents the interpretive boundary: AI-judge scores are reproducible technical screening outputs, not expert regulatory validation.</w:t>
+      </w:r>
+    </w:p>
+    <w:p>
       <w:pPr>
         <w:pStyle w:val="Heading2"/>
         <w:spacing w:before="280" w:after="120"/>
@@ -1607,6 +1602,11 @@
           <w:sz w:val="24"/>
         </w:rPr>
         <w:t>Supplementary File 5. Representative questions and per-question results</w:t>
+      </w:r>
+    </w:p>
+    <w:p>
+      <w:r>
+        <w:t>Supplementary Data S1 provides a consolidated per-question audit table for the reported evaluation rows. It contains 404 evaluated rows across six stages: 150 internal held-out rows, 75 English completeness-repair rows, 75 Portuguese residual-quality rows, 50 AI-authored prospective stress-test rows, 24 refusal-calibration development rows, and 30 refusal-focused AI-authored test rows. The table includes the question, generated answer, expected answer fields when available, retrieval and citation outputs, deterministic metrics, AI-judge scores, detected error flags, and the fix or action linked to each row. The 404 evaluated rows should not be described as a 500-question evaluation.</w:t>
       </w:r>
     </w:p>
     <w:p>

</xml_diff>

<commit_message>
Replace Streamlit supplement with answer screenshot
</commit_message>
<xml_diff>
--- a/evaluation/publication_results/manuscript_package_20260719/tirs_final_submission_package_20260720/submission_upload_files_20260720/03_Supplementary_Information_20260720.docx
+++ b/evaluation/publication_results/manuscript_package_20260719/tirs_final_submission_package_20260720/submission_upload_files_20260720/03_Supplementary_Information_20260720.docx
@@ -1833,11 +1833,9 @@
       <w:r>
         <w:rPr>
           <w:rFonts w:ascii="Times New Roman" w:hAnsi="Times New Roman"/>
-          <w:b/>
           <w:color w:val="000000"/>
-          <w:sz w:val="24"/>
         </w:rPr>
-        <w:t>Supplementary Figure S4. Streamlit interface and app smoke test</w:t>
+        <w:t>Supplementary Figure S4. Streamlit RAG-answer smoke test</w:t>
       </w:r>
     </w:p>
     <w:p>
@@ -1845,9 +1843,8 @@
         <w:rPr>
           <w:rFonts w:ascii="Times New Roman" w:hAnsi="Times New Roman"/>
           <w:color w:val="000000"/>
-          <w:sz w:val="22"/>
         </w:rPr>
-        <w:t>The screenshot shows the local Streamlit interface used for bilingual ANVISA question answering. On 2026-07-21, the app stack loaded with the configured Python environment, persisted vector index, hybrid retrieval, reranker, and Gemini wrapper. A backend smoke test using the question "What does RDC 945/2024 regulate?" rewrote the query to Portuguese, returned five source nodes, and generated an answer citing [RDC 945/2024, Art. 1]. This was an application smoke test, not an additional benchmark result.</w:t>
+        <w:t>The screenshot shows a local Streamlit evidence view with the RAG answer and retrieved sources. On 2026-07-21, the app stack loaded with the configured Python environment, persisted vector index, hybrid retrieval, reranker, and Gemini wrapper. A backend smoke test using the question "What does RDC 945/2024 regulate?" rewrote the query to Portuguese, returned five source nodes, and generated an answer citing [RDC 945/2024, Art. 1]. This was an application smoke test, not an additional benchmark result.</w:t>
       </w:r>
     </w:p>
     <w:p>
@@ -1894,11 +1891,9 @@
       <w:r>
         <w:rPr>
           <w:rFonts w:ascii="Times New Roman" w:hAnsi="Times New Roman"/>
-          <w:i/>
           <w:color w:val="000000"/>
-          <w:sz w:val="20"/>
         </w:rPr>
-        <w:t>Supplementary Figure S4. Streamlit interface of the ANVISA Navigator prototype during local smoke testing.</w:t>
+        <w:t>Supplementary Figure S4. Streamlit evidence view showing a RAG answer and retrieved sources during local smoke testing.</w:t>
       </w:r>
     </w:p>
     <w:sectPr>

</xml_diff>